<commit_message>
Replace HPP template draft with real SKLADNÍCI contract text
Digitizes the user's actual pracovní smlouva (like dpp/dpc before it):
company, position, workplace, start date, salary, probation and
contract-term stay dynamic via the existing field/context wiring, while
the rest of the legal wording is preserved verbatim. Workplace is not
hardcoded to ČR (that override stays DPP-only).

Co-Authored-By: Claude Sonnet 5 <noreply@anthropic.com>
</commit_message>
<xml_diff>
--- a/backend/app/templates/hpp_template.docx
+++ b/backend/app/templates/hpp_template.docx
@@ -3,448 +3,433 @@
 <w:document xmlns:wpc="http://schemas.microsoft.com/office/word/2010/wordprocessingCanvas" xmlns:mo="http://schemas.microsoft.com/office/mac/office/2008/main" xmlns:mc="http://schemas.openxmlformats.org/markup-compatibility/2006" xmlns:mv="urn:schemas-microsoft-com:mac:vml" xmlns:o="urn:schemas-microsoft-com:office:office" xmlns:r="http://schemas.openxmlformats.org/officeDocument/2006/relationships" xmlns:m="http://schemas.openxmlformats.org/officeDocument/2006/math" xmlns:v="urn:schemas-microsoft-com:vml" xmlns:wp14="http://schemas.microsoft.com/office/word/2010/wordprocessingDrawing" xmlns:wp="http://schemas.openxmlformats.org/drawingml/2006/wordprocessingDrawing" xmlns:w10="urn:schemas-microsoft-com:office:word" xmlns:w="http://schemas.openxmlformats.org/wordprocessingml/2006/main" xmlns:w14="http://schemas.microsoft.com/office/word/2010/wordml" xmlns:wpg="http://schemas.microsoft.com/office/word/2010/wordprocessingGroup" xmlns:wpi="http://schemas.microsoft.com/office/word/2010/wordprocessingInk" xmlns:wne="http://schemas.microsoft.com/office/word/2006/wordml" xmlns:wps="http://schemas.microsoft.com/office/word/2010/wordprocessingShape" mc:Ignorable="w14 wp14">
   <w:body>
     <w:p>
-      <w:pPr>
-        <w:jc w:val="center"/>
-      </w:pPr>
       <w:r>
         <w:rPr>
+          <w:rFonts w:ascii="Arial" w:hAnsi="Arial"/>
           <w:b/>
-          <w:i w:val="0"/>
-          <w:sz w:val="32"/>
+          <w:sz w:val="22"/>
         </w:rPr>
-        <w:t>PRACOVNÍ SMLOUVA</w:t>
+        <w:t>Zaměstnavatel:</w:t>
       </w:r>
-    </w:p>
-    <w:p>
-      <w:pPr>
-        <w:jc w:val="center"/>
-      </w:pPr>
       <w:r>
         <w:rPr>
+          <w:rFonts w:ascii="Arial" w:hAnsi="Arial"/>
           <w:b w:val="0"/>
-          <w:i w:val="0"/>
+          <w:sz w:val="22"/>
         </w:rPr>
-        <w:t>(§ 34 a násl. zákoníku práce)</w:t>
-      </w:r>
-    </w:p>
-    <w:p/>
-    <w:p>
-      <w:r>
-        <w:rPr>
-          <w:b w:val="0"/>
-          <w:i w:val="0"/>
-        </w:rPr>
-        <w:t>Zaměstnavatel: {{FIRMA}}</w:t>
+        <w:tab/>
+        <w:t>název</w:t>
+        <w:tab/>
+        <w:t>{{FIRMA}}</w:t>
       </w:r>
     </w:p>
     <w:p>
       <w:r>
         <w:rPr>
+          <w:rFonts w:ascii="Arial" w:hAnsi="Arial"/>
           <w:b w:val="0"/>
-          <w:i w:val="0"/>
+          <w:sz w:val="22"/>
         </w:rPr>
-        <w:t>IČO: {{ICO}}</w:t>
+        <w:tab/>
+        <w:t>sídlo</w:t>
+        <w:tab/>
+        <w:t>{{ADRESA_FIRMY}}</w:t>
       </w:r>
     </w:p>
     <w:p>
       <w:r>
         <w:rPr>
+          <w:rFonts w:ascii="Arial" w:hAnsi="Arial"/>
           <w:b w:val="0"/>
-          <w:i w:val="0"/>
+          <w:sz w:val="22"/>
         </w:rPr>
-        <w:t>DIČ: {{DIC}}</w:t>
+        <w:tab/>
+        <w:t>IČO</w:t>
+        <w:tab/>
+        <w:t>{{ICO}}</w:t>
       </w:r>
     </w:p>
     <w:p>
       <w:r>
         <w:rPr>
+          <w:rFonts w:ascii="Arial" w:hAnsi="Arial"/>
           <w:b w:val="0"/>
-          <w:i w:val="0"/>
+          <w:sz w:val="22"/>
         </w:rPr>
-        <w:t>sídlem: {{ADRESA_FIRMY}}</w:t>
       </w:r>
     </w:p>
     <w:p>
       <w:r>
         <w:rPr>
+          <w:rFonts w:ascii="Arial" w:hAnsi="Arial"/>
+          <w:b/>
+          <w:sz w:val="22"/>
+        </w:rPr>
+        <w:t>a zaměstnanec:</w:t>
+      </w:r>
+      <w:r>
+        <w:rPr>
+          <w:rFonts w:ascii="Arial" w:hAnsi="Arial"/>
           <w:b w:val="0"/>
-          <w:i w:val="0"/>
+          <w:sz w:val="22"/>
         </w:rPr>
-        <w:t>zastoupený: {{ZASTUPCE_FIRMY}}</w:t>
+        <w:tab/>
+        <w:t>jméno a příjmení: {{JMENO}} {{PRIJMENI}}</w:t>
       </w:r>
     </w:p>
     <w:p>
       <w:r>
         <w:rPr>
+          <w:rFonts w:ascii="Arial" w:hAnsi="Arial"/>
           <w:b w:val="0"/>
-          <w:i w:val="0"/>
+          <w:sz w:val="22"/>
         </w:rPr>
-        <w:t>(dále jen „zaměstnavatel“)</w:t>
-      </w:r>
-    </w:p>
-    <w:p/>
-    <w:p>
-      <w:r>
-        <w:rPr>
-          <w:b w:val="0"/>
-          <w:i w:val="0"/>
-        </w:rPr>
-        <w:t>a</w:t>
-      </w:r>
-    </w:p>
-    <w:p/>
-    <w:p>
-      <w:r>
-        <w:rPr>
-          <w:b w:val="0"/>
-          <w:i w:val="0"/>
-        </w:rPr>
-        <w:t>Zaměstnanec: {{JMENO}} {{PRIJMENI}}</w:t>
+        <w:tab/>
+        <w:tab/>
+        <w:t>bydliště: {{ADRESA}}</w:t>
       </w:r>
     </w:p>
     <w:p>
       <w:r>
         <w:rPr>
+          <w:rFonts w:ascii="Arial" w:hAnsi="Arial"/>
           <w:b w:val="0"/>
-          <w:i w:val="0"/>
+          <w:sz w:val="22"/>
         </w:rPr>
-        <w:t>Narozen/a: {{DATUM_NAROZENI}}</w:t>
+        <w:tab/>
+        <w:tab/>
+        <w:t>datum narození: {{DATUM_NAROZENI}}</w:t>
       </w:r>
     </w:p>
     <w:p>
       <w:r>
         <w:rPr>
+          <w:rFonts w:ascii="Arial" w:hAnsi="Arial"/>
           <w:b w:val="0"/>
-          <w:i w:val="0"/>
+          <w:sz w:val="22"/>
         </w:rPr>
-        <w:t>Bytem: {{ADRESA}}</w:t>
       </w:r>
     </w:p>
     <w:p>
       <w:r>
         <w:rPr>
+          <w:rFonts w:ascii="Arial" w:hAnsi="Arial"/>
           <w:b w:val="0"/>
-          <w:i w:val="0"/>
+          <w:sz w:val="22"/>
         </w:rPr>
-        <w:t>Číslo dokladu totožnosti: {{CISLO_DOKLADU}}</w:t>
+        <w:t>uzavírají tuto</w:t>
+        <w:tab/>
+      </w:r>
+      <w:r>
+        <w:rPr>
+          <w:rFonts w:ascii="Arial" w:hAnsi="Arial"/>
+          <w:b/>
+          <w:sz w:val="22"/>
+        </w:rPr>
+        <w:t>P R A C O V N Í   S M L O U V U :</w:t>
       </w:r>
     </w:p>
     <w:p>
       <w:r>
         <w:rPr>
+          <w:rFonts w:ascii="Arial" w:hAnsi="Arial"/>
           <w:b w:val="0"/>
-          <w:i w:val="0"/>
+          <w:sz w:val="22"/>
         </w:rPr>
-        <w:t>Trvalá adresa v zemi původu: {{ADRESA_PUVODU}}</w:t>
       </w:r>
     </w:p>
     <w:p>
       <w:r>
         <w:rPr>
+          <w:rFonts w:ascii="Arial" w:hAnsi="Arial"/>
           <w:b w:val="0"/>
-          <w:i w:val="0"/>
+          <w:sz w:val="22"/>
         </w:rPr>
-        <w:t>Číslo víza (u cizinců): {{CISLO_VIZA}}</w:t>
+        <w:t>1.</w:t>
+        <w:tab/>
+        <w:t>Zaměstnanec bude pracovat jako: {{POZICE}}.</w:t>
       </w:r>
     </w:p>
     <w:p>
       <w:r>
         <w:rPr>
+          <w:rFonts w:ascii="Arial" w:hAnsi="Arial"/>
           <w:b w:val="0"/>
-          <w:i w:val="0"/>
+          <w:sz w:val="22"/>
         </w:rPr>
-        <w:t>Platnost víza do (u cizinců): {{PLATNOST_VIZA}}</w:t>
       </w:r>
     </w:p>
     <w:p>
       <w:r>
         <w:rPr>
+          <w:rFonts w:ascii="Arial" w:hAnsi="Arial"/>
           <w:b w:val="0"/>
-          <w:i w:val="0"/>
+          <w:sz w:val="22"/>
         </w:rPr>
-        <w:t>Druh pobytu na území ČR (u cizinců): {{DRUH_POBYTU}}</w:t>
+        <w:t>2. Místem výkonu práce je {{MISTO_VYKONU}}.</w:t>
       </w:r>
     </w:p>
     <w:p>
       <w:r>
         <w:rPr>
+          <w:rFonts w:ascii="Arial" w:hAnsi="Arial"/>
           <w:b w:val="0"/>
-          <w:i w:val="0"/>
+          <w:sz w:val="22"/>
         </w:rPr>
-        <w:t>(dále jen „zaměstnanec“)</w:t>
-      </w:r>
-    </w:p>
-    <w:p/>
-    <w:p>
-      <w:r>
-        <w:rPr>
-          <w:b w:val="0"/>
-          <w:i w:val="0"/>
-        </w:rPr>
-        <w:t>uzavírají podle § 34 a násl. zákona č. 262/2006 Sb., zákoníku práce, ve znění pozdějších předpisů (dále jen „zákoník práce“), tuto</w:t>
       </w:r>
     </w:p>
     <w:p>
       <w:r>
         <w:rPr>
-          <w:b/>
-          <w:i w:val="0"/>
+          <w:rFonts w:ascii="Arial" w:hAnsi="Arial"/>
+          <w:b w:val="0"/>
+          <w:sz w:val="22"/>
         </w:rPr>
-        <w:t>pracovní smlouvu:</w:t>
-      </w:r>
-    </w:p>
-    <w:p/>
-    <w:p>
-      <w:r>
-        <w:rPr>
-          <w:b/>
-          <w:i w:val="0"/>
-        </w:rPr>
-        <w:t>1. Druh práce</w:t>
+        <w:t>3. Den nástupu do práce je {{DATUM_NASTUPU}}. Tímto dnem vzniká mezi zaměstnavatelem a zaměstnancem pracovní poměr. Výpovědní doba je dvouměsíční, pokud není v Zákoníku práce stanoveno jinak.</w:t>
       </w:r>
     </w:p>
     <w:p>
       <w:r>
         <w:rPr>
+          <w:rFonts w:ascii="Arial" w:hAnsi="Arial"/>
           <w:b w:val="0"/>
-          <w:i w:val="0"/>
+          <w:sz w:val="22"/>
         </w:rPr>
-        <w:t>Zaměstnanec bude pro zaměstnavatele vykonávat práci ve funkci – {{POZICE}}.</w:t>
-      </w:r>
-    </w:p>
-    <w:p/>
-    <w:p>
-      <w:r>
-        <w:rPr>
-          <w:b/>
-          <w:i w:val="0"/>
-        </w:rPr>
-        <w:t>2. Místo výkonu práce</w:t>
       </w:r>
     </w:p>
     <w:p>
       <w:r>
         <w:rPr>
+          <w:rFonts w:ascii="Arial" w:hAnsi="Arial"/>
           <w:b w:val="0"/>
-          <w:i w:val="0"/>
+          <w:sz w:val="22"/>
         </w:rPr>
-        <w:t>Místem výkonu práce je: {{MISTO_VYKONU}}.</w:t>
-      </w:r>
-    </w:p>
-    <w:p/>
-    <w:p>
-      <w:r>
-        <w:rPr>
-          <w:b/>
-          <w:i w:val="0"/>
-        </w:rPr>
-        <w:t>3. Den nástupu do práce</w:t>
+        <w:t>4. Smluvní strany se dohodly na těchto dalších podmínkách:</w:t>
       </w:r>
     </w:p>
     <w:p>
       <w:r>
         <w:rPr>
+          <w:rFonts w:ascii="Arial" w:hAnsi="Arial"/>
           <w:b w:val="0"/>
-          <w:i w:val="0"/>
+          <w:sz w:val="22"/>
         </w:rPr>
-        <w:t>Zaměstnanec nastoupí do práce dne {{DATUM_NASTUPU}}.</w:t>
-      </w:r>
-    </w:p>
-    <w:p/>
-    <w:p>
-      <w:r>
-        <w:rPr>
-          <w:b/>
-          <w:i w:val="0"/>
-        </w:rPr>
-        <w:t>4. Zkušební doba</w:t>
+        <w:t>a) {% if DOBA_NEURCITA %}pracovní poměr uzavírají na dobu neurčitou;{% else %}pracovní poměr uzavírají na dobu určitou, a to do {{DATUM_UKONCENI}};{% endif %}</w:t>
       </w:r>
     </w:p>
     <w:p>
       <w:r>
         <w:rPr>
+          <w:rFonts w:ascii="Arial" w:hAnsi="Arial"/>
           <w:b w:val="0"/>
-          <w:i w:val="0"/>
+          <w:sz w:val="22"/>
         </w:rPr>
-        <w:t>{% if ZKUSEBNI_DOBA %}Zkušební doba se sjednává na {{ZKUSEBNI_DOBA}}. V souladu s § 35 zákoníku práce nesmí zkušební doba přesáhnout polovinu sjednané doby trvání pracovního poměru; u řadových zaměstnanců činí nejvýše 4 měsíce, u vedoucích zaměstnanců nejvýše 8 měsíců.{% else %}Zkušební doba se nesjednává.{% endif %}</w:t>
-      </w:r>
-    </w:p>
-    <w:p/>
-    <w:p>
-      <w:r>
-        <w:rPr>
-          <w:b/>
-          <w:i w:val="0"/>
-        </w:rPr>
-        <w:t>5. Doba trvání pracovního poměru</w:t>
+        <w:t>b) sjednávají 5,0 - denní a rovnoměrně rozvrženou pracovní dobu v rozsahu 40,00 hodin týdně;</w:t>
       </w:r>
     </w:p>
     <w:p>
       <w:r>
         <w:rPr>
+          <w:rFonts w:ascii="Arial" w:hAnsi="Arial"/>
           <w:b w:val="0"/>
-          <w:i w:val="0"/>
+          <w:sz w:val="22"/>
         </w:rPr>
-        <w:t>{% if DOBA_NEURCITA %}Pracovní poměr se sjednává na dobu neurčitou.{% else %}Pracovní poměr se sjednává na dobu určitou, a to do {{DATUM_UKONCENI}}.{% endif %}</w:t>
-      </w:r>
-    </w:p>
-    <w:p/>
-    <w:p>
-      <w:r>
-        <w:rPr>
-          <w:b/>
-          <w:i w:val="0"/>
-        </w:rPr>
-        <w:t>6. Mzda</w:t>
+        <w:t>c) {% if ZKUSEBNI_DOBA %}sjednávají zkušební dobu v délce {{ZKUSEBNI_DOBA}}, ve které mohou obě strany ukončit pracovní poměr bez udání důvodu;{% else %}zkušební dobu nesjednávají;{% endif %}</w:t>
       </w:r>
     </w:p>
     <w:p>
       <w:r>
         <w:rPr>
+          <w:rFonts w:ascii="Arial" w:hAnsi="Arial"/>
           <w:b w:val="0"/>
-          <w:i w:val="0"/>
+          <w:sz w:val="22"/>
         </w:rPr>
-        <w:t>Zaměstnanci přísluší mzda ve výši {{MZDA}} Kč měsíčně, splatná na bankovní účet {{BANKOVNI_UCET}} v pravidelném výplatním termínu zaměstnavatele. Sjednaná mzda nesmí být nižší než aktuální zákonem stanovená minimální (příp. zaručená) mzda.</w:t>
-      </w:r>
-    </w:p>
-    <w:p/>
-    <w:p>
-      <w:r>
-        <w:rPr>
-          <w:b/>
-          <w:i w:val="0"/>
-        </w:rPr>
-        <w:t>7. Pracovní doba</w:t>
+        <w:t>d) zaměstnanec souhlasí s vysíláním na jednodenní pracovní cesty vlastním osobním autem v okruhu do 300 km od sídla firmy.</w:t>
       </w:r>
     </w:p>
     <w:p>
       <w:r>
         <w:rPr>
+          <w:rFonts w:ascii="Arial" w:hAnsi="Arial"/>
           <w:b w:val="0"/>
-          <w:i w:val="0"/>
+          <w:sz w:val="22"/>
         </w:rPr>
-        <w:t>Týdenní pracovní doba činí {{HODIN_TYDNE}} hodin.</w:t>
-      </w:r>
-    </w:p>
-    <w:p/>
-    <w:p>
-      <w:r>
-        <w:rPr>
-          <w:b/>
-          <w:i w:val="0"/>
-        </w:rPr>
-        <w:t>8. Ostatní ujednání</w:t>
       </w:r>
     </w:p>
     <w:p>
       <w:r>
         <w:rPr>
+          <w:rFonts w:ascii="Arial" w:hAnsi="Arial"/>
           <w:b w:val="0"/>
-          <w:i w:val="0"/>
+          <w:sz w:val="22"/>
         </w:rPr>
-        <w:t>Zaměstnanec je povinen konat sjednanou práci osobně podle pokynů zaměstnavatele a v souladu s právními a ostatními předpisy vztahujícími se k výkonu práce, zejména předpisy k zajištění bezpečnosti a ochrany zdraví při práci. Zaměstnanec předloží zaměstnavateli nejpozději v den nástupu do práce platný doklad totožnosti; je-li cizím státním příslušníkem, předloží dále i platný doklad opravňující k pobytu a výkonu práce na území ČR.</w:t>
+        <w:t>5. Nástupní tarif zaměstnance je {{MZDA}} Kč za měsíc. Zaměstnavatel po uplynutí zkušební doby upraví tarif podle dosahovaných pracovních výsledků zaměstnance. K tarifu se poskytují další odměny a příplatky podle pravidel stanovených vnitřními předpisy.</w:t>
       </w:r>
     </w:p>
     <w:p>
       <w:r>
         <w:rPr>
+          <w:rFonts w:ascii="Arial" w:hAnsi="Arial"/>
           <w:b w:val="0"/>
-          <w:i w:val="0"/>
+          <w:sz w:val="22"/>
         </w:rPr>
-        <w:t>Práva a povinnosti účastníků této smlouvy, které nejsou touto smlouvou výslovně upraveny, se řídí příslušnými ustanoveními zákoníku práce a souvisejících právních předpisů.</w:t>
       </w:r>
     </w:p>
     <w:p>
       <w:r>
         <w:rPr>
+          <w:rFonts w:ascii="Arial" w:hAnsi="Arial"/>
           <w:b w:val="0"/>
-          <w:i w:val="0"/>
+          <w:sz w:val="22"/>
         </w:rPr>
-        <w:t>Tato smlouva je vyhotovena ve dvou stejnopisech, každá strana obdrží jedno vyhotovení.</w:t>
+        <w:t>6. Zaměstnanec má nárok na 20 dnů dovolené na zotavenou ročně.</w:t>
       </w:r>
     </w:p>
     <w:p>
       <w:r>
         <w:rPr>
+          <w:rFonts w:ascii="Arial" w:hAnsi="Arial"/>
           <w:b w:val="0"/>
-          <w:i w:val="0"/>
+          <w:sz w:val="22"/>
         </w:rPr>
-        <w:t>Smluvní strany prohlašují, že si tuto smlouvu před jejím podpisem přečetly, s jejím obsahem souhlasí a že byla sepsána na základě jejich svobodné a vážné vůle, nikoli v tísni ani za nápadně nevýhodných podmínek, na důkaz čehož připojují své podpisy.</w:t>
       </w:r>
     </w:p>
-    <w:p/>
     <w:p>
       <w:r>
         <w:rPr>
+          <w:rFonts w:ascii="Arial" w:hAnsi="Arial"/>
           <w:b w:val="0"/>
-          <w:i w:val="0"/>
+          <w:sz w:val="22"/>
+        </w:rPr>
+        <w:t>7. Zúčtovanou měsíční mzdu zaměstnavatel odešle nejpozději 20. den následujícího měsíce bezhotovostním převodem na účet zaměstnance, nebo vyplatí v hotovosti k rukám zaměstnance.</w:t>
+      </w:r>
+    </w:p>
+    <w:p>
+      <w:r>
+        <w:rPr>
+          <w:rFonts w:ascii="Arial" w:hAnsi="Arial"/>
+          <w:b w:val="0"/>
+          <w:sz w:val="22"/>
+        </w:rPr>
+      </w:r>
+    </w:p>
+    <w:p>
+      <w:r>
+        <w:rPr>
+          <w:rFonts w:ascii="Arial" w:hAnsi="Arial"/>
+          <w:b w:val="0"/>
+          <w:sz w:val="22"/>
+        </w:rPr>
+        <w:t>8. Zaměstnanec je povinen svědomitě vykonávat sjednanou práci ve stanovené pracovní době, řídit se pokyny zaměstnavatele a dodržovat právní a ostatní předpisy o bezpečnosti a ochraně zdraví, s kterými byl seznámen předem.</w:t>
+      </w:r>
+    </w:p>
+    <w:p>
+      <w:r>
+        <w:rPr>
+          <w:rFonts w:ascii="Arial" w:hAnsi="Arial"/>
+          <w:b w:val="0"/>
+          <w:sz w:val="22"/>
+        </w:rPr>
+      </w:r>
+    </w:p>
+    <w:p>
+      <w:r>
+        <w:rPr>
+          <w:rFonts w:ascii="Arial" w:hAnsi="Arial"/>
+          <w:b w:val="0"/>
+          <w:sz w:val="22"/>
+        </w:rPr>
+        <w:t>9. Veškeré další nároky a povinnosti smluvních stran vyplývají ze Zákoníku práce, prováděcích předpisů a vnitřních předpisů, s kterými byl zaměstnanec seznámen předem. Změna sjednaných podmínek je možná jen se souhlasem obou účastníků písemným dodatkem k této smlouvě.</w:t>
+      </w:r>
+    </w:p>
+    <w:p>
+      <w:r>
+        <w:rPr>
+          <w:rFonts w:ascii="Arial" w:hAnsi="Arial"/>
+          <w:b w:val="0"/>
+          <w:sz w:val="22"/>
+        </w:rPr>
+      </w:r>
+    </w:p>
+    <w:p>
+      <w:r>
+        <w:rPr>
+          <w:rFonts w:ascii="Arial" w:hAnsi="Arial"/>
+          <w:b w:val="0"/>
+          <w:sz w:val="22"/>
         </w:rPr>
         <w:t>V {{MISTO_PODPISU}} dne {{DATUM_DNES}}</w:t>
       </w:r>
     </w:p>
-    <w:p/>
-    <w:tbl>
-      <w:tblPr>
-        <w:tblW w:type="auto" w:w="0"/>
-        <w:tblLook w:firstColumn="1" w:firstRow="1" w:lastColumn="0" w:lastRow="0" w:noHBand="0" w:noVBand="1" w:val="04A0"/>
-      </w:tblPr>
-      <w:tblGrid>
-        <w:gridCol w:w="4320"/>
-        <w:gridCol w:w="4320"/>
-      </w:tblGrid>
-      <w:tr>
-        <w:tc>
-          <w:tcPr>
-            <w:tcW w:type="dxa" w:w="4320"/>
-          </w:tcPr>
-          <w:p>
-            <w:r>
-              <w:t>zaměstnavatel</w:t>
-            </w:r>
-          </w:p>
-        </w:tc>
-        <w:tc>
-          <w:tcPr>
-            <w:tcW w:type="dxa" w:w="4320"/>
-          </w:tcPr>
-          <w:p>
-            <w:r>
-              <w:t>zaměstnanec</w:t>
-            </w:r>
-          </w:p>
-        </w:tc>
-      </w:tr>
-      <w:tr>
-        <w:tc>
-          <w:tcPr>
-            <w:tcW w:type="dxa" w:w="4320"/>
-          </w:tcPr>
-          <w:p>
-            <w:r>
-              <w:t>{{PODPIS_ZAMESTNAVATELE}}</w:t>
-            </w:r>
-          </w:p>
-        </w:tc>
-        <w:tc>
-          <w:tcPr>
-            <w:tcW w:type="dxa" w:w="4320"/>
-          </w:tcPr>
-          <w:p>
-            <w:r>
-              <w:t>{{PODPIS_ZAMESTNANCE}}</w:t>
-            </w:r>
-          </w:p>
-        </w:tc>
-      </w:tr>
-    </w:tbl>
-    <w:p/>
     <w:p>
       <w:r>
         <w:rPr>
+          <w:rFonts w:ascii="Arial" w:hAnsi="Arial"/>
           <w:b w:val="0"/>
-          <w:i/>
+          <w:sz w:val="22"/>
         </w:rPr>
-        <w:t>Tato šablona vychází z veřejně dostupných požadavků zákoníku práce k roku 2026 a nepředstavuje právní poradenství; před použitím doporučujeme kontrolu právníkem nebo mzdovou účetní.</w:t>
+      </w:r>
+    </w:p>
+    <w:p>
+      <w:r>
+        <w:rPr>
+          <w:rFonts w:ascii="Arial" w:hAnsi="Arial"/>
+          <w:b w:val="0"/>
+          <w:sz w:val="22"/>
+        </w:rPr>
+        <w:t>Zaměstnanec:</w:t>
+        <w:tab/>
+        <w:tab/>
+        <w:tab/>
+        <w:tab/>
+        <w:tab/>
+        <w:tab/>
+        <w:tab/>
+        <w:t>Zaměstnavatel:</w:t>
+      </w:r>
+    </w:p>
+    <w:p>
+      <w:r>
+        <w:rPr>
+          <w:rFonts w:ascii="Arial" w:hAnsi="Arial"/>
+          <w:b w:val="0"/>
+          <w:sz w:val="22"/>
+        </w:rPr>
+        <w:tab/>
+        <w:tab/>
+        <w:tab/>
+        <w:tab/>
+        <w:tab/>
+        <w:tab/>
+        <w:tab/>
+        <w:t>(razítko a podpis)</w:t>
+      </w:r>
+    </w:p>
+    <w:p>
+      <w:r>
+        <w:rPr>
+          <w:rFonts w:ascii="Arial" w:hAnsi="Arial"/>
+          <w:b w:val="0"/>
+          <w:sz w:val="22"/>
+        </w:rPr>
+      </w:r>
+    </w:p>
+    <w:p>
+      <w:r>
+        <w:rPr>
+          <w:rFonts w:ascii="Arial" w:hAnsi="Arial"/>
+          <w:b w:val="0"/>
+          <w:sz w:val="22"/>
+        </w:rPr>
+        <w:t>{{PODPIS_ZAMESTNANCE}}</w:t>
+        <w:tab/>
+        <w:tab/>
+        <w:tab/>
+        <w:tab/>
+        <w:tab/>
+        <w:tab/>
+        <w:tab/>
+        <w:t>{{PODPIS_ZAMESTNAVATELE}}</w:t>
       </w:r>
     </w:p>
     <w:sectPr>
@@ -820,6 +805,10 @@
     <w:name w:val="Normal"/>
     <w:qFormat/>
     <w:rsid w:val="00FC693F"/>
+    <w:rPr>
+      <w:rFonts w:ascii="Arial" w:hAnsi="Arial" w:eastAsia="Arial"/>
+      <w:sz w:val="22"/>
+    </w:rPr>
   </w:style>
   <w:style w:type="paragraph" w:styleId="Header">
     <w:name w:val="header"/>

</xml_diff>

<commit_message>
Align HPP employer-block formatting with DPP/DPČ
Drops the SKLADNÍCI source doc's own "název"/"sídlo" sub-labels in
favor of the plain "Zaměstnavatel: {{FIRMA}}" / "IČO: {{ICO}}" /
"sídlem: {{ADRESA_FIRMY}}" lines already used by DPP and DPČ, so all
three contract types look the same in the header. Rest of the HPP
body (points 1-9) is unchanged.

Co-Authored-By: Claude Sonnet 5 <noreply@anthropic.com>
</commit_message>
<xml_diff>
--- a/backend/app/templates/hpp_template.docx
+++ b/backend/app/templates/hpp_template.docx
@@ -9,7 +9,7 @@
           <w:b/>
           <w:sz w:val="22"/>
         </w:rPr>
-        <w:t>Zaměstnavatel:</w:t>
+        <w:t xml:space="preserve">Zaměstnavatel: </w:t>
       </w:r>
       <w:r>
         <w:rPr>
@@ -17,9 +17,6 @@
           <w:b w:val="0"/>
           <w:sz w:val="22"/>
         </w:rPr>
-        <w:tab/>
-        <w:t>název</w:t>
-        <w:tab/>
         <w:t>{{FIRMA}}</w:t>
       </w:r>
     </w:p>
@@ -30,10 +27,7 @@
           <w:b w:val="0"/>
           <w:sz w:val="22"/>
         </w:rPr>
-        <w:tab/>
-        <w:t>sídlo</w:t>
-        <w:tab/>
-        <w:t>{{ADRESA_FIRMY}}</w:t>
+        <w:t>IČO: {{ICO}}</w:t>
       </w:r>
     </w:p>
     <w:p>
@@ -43,10 +37,7 @@
           <w:b w:val="0"/>
           <w:sz w:val="22"/>
         </w:rPr>
-        <w:tab/>
-        <w:t>IČO</w:t>
-        <w:tab/>
-        <w:t>{{ICO}}</w:t>
+        <w:t>sídlem: {{ADRESA_FIRMY}}</w:t>
       </w:r>
     </w:p>
     <w:p>

</xml_diff>

<commit_message>
Add title line to hpp_template.docx so it shows up in the type dropdown
list_templates() derives each contract's dropdown label from its first
non-empty paragraph. The SKLADNÍCI-based rewrite dropped the old
"PRACOVNÍ SMLOUVA" title line entirely, so that paragraph became
"Zaměstnavatel: {{FIRMA}}" instead — HPP was still a valid, selectable
entry, just showing a raw unrendered placeholder as its label instead
of a real title, making it easy to miss in the list. Restores the
title line, matching DPP/DPČ's own title-line convention.

Co-Authored-By: Claude Sonnet 5 <noreply@anthropic.com>
</commit_message>
<xml_diff>
--- a/backend/app/templates/hpp_template.docx
+++ b/backend/app/templates/hpp_template.docx
@@ -2,6 +2,16 @@
 <file path=word/document.xml><?xml version="1.0" encoding="utf-8"?>
 <w:document xmlns:wpc="http://schemas.microsoft.com/office/word/2010/wordprocessingCanvas" xmlns:mo="http://schemas.microsoft.com/office/mac/office/2008/main" xmlns:mc="http://schemas.openxmlformats.org/markup-compatibility/2006" xmlns:mv="urn:schemas-microsoft-com:mac:vml" xmlns:o="urn:schemas-microsoft-com:office:office" xmlns:r="http://schemas.openxmlformats.org/officeDocument/2006/relationships" xmlns:m="http://schemas.openxmlformats.org/officeDocument/2006/math" xmlns:v="urn:schemas-microsoft-com:vml" xmlns:wp14="http://schemas.microsoft.com/office/word/2010/wordprocessingDrawing" xmlns:wp="http://schemas.openxmlformats.org/drawingml/2006/wordprocessingDrawing" xmlns:w10="urn:schemas-microsoft-com:office:word" xmlns:w="http://schemas.openxmlformats.org/wordprocessingml/2006/main" xmlns:w14="http://schemas.microsoft.com/office/word/2010/wordml" xmlns:wpg="http://schemas.microsoft.com/office/word/2010/wordprocessingGroup" xmlns:wpi="http://schemas.microsoft.com/office/word/2010/wordprocessingInk" xmlns:wne="http://schemas.microsoft.com/office/word/2006/wordml" xmlns:wps="http://schemas.microsoft.com/office/word/2010/wordprocessingShape" mc:Ignorable="w14 wp14">
   <w:body>
+    <w:p>
+      <w:r>
+        <w:rPr>
+          <w:rFonts w:ascii="Arial" w:hAnsi="Arial"/>
+          <w:b/>
+          <w:sz w:val="28"/>
+        </w:rPr>
+        <w:t>PRACOVNÍ SMLOUVA</w:t>
+      </w:r>
+    </w:p>
     <w:p>
       <w:r>
         <w:rPr>

</xml_diff>

<commit_message>
Match HPP template formatting to the real SKLADNÍCI original
Previous HPP formatting fixes only touched header layout, line breaks,
and the dropdown title - the actual visible mismatch was untouched:
the digitized template used Arial at a uniform 11pt, while the real
signed source (HR/HPP/...SKLADNÍCI.rtf, parsed programmatically for
bold state) is Courier New throughout, drops to 10pt for numbered
clauses 1-9, and has the filled-in start date and salary rendered
bold. Fixed all three; {{DATUM_NASTUPU}} and {{MZDA}} are now split
into their own bold runs so docxtpl renders the substituted values
bold, matching the original.

Verified against DPP/DPČ/GDPR/health-declaration templates too (all
already matched their own real originals run-for-run, no changes
needed there) and regenerated all three contract types through
fill_blank() for a structural check; full test suite passes.

Co-Authored-By: Claude Sonnet 5 <noreply@anthropic.com>
</commit_message>
<xml_diff>
--- a/backend/app/templates/hpp_template.docx
+++ b/backend/app/templates/hpp_template.docx
@@ -5,7 +5,7 @@
     <w:p>
       <w:r>
         <w:rPr>
-          <w:rFonts w:ascii="Arial" w:hAnsi="Arial"/>
+          <w:rFonts w:ascii="Courier New" w:hAnsi="Courier New"/>
           <w:b/>
           <w:sz w:val="28"/>
         </w:rPr>
@@ -15,7 +15,7 @@
     <w:p>
       <w:r>
         <w:rPr>
-          <w:rFonts w:ascii="Arial" w:hAnsi="Arial"/>
+          <w:rFonts w:ascii="Courier New" w:hAnsi="Courier New"/>
           <w:b/>
           <w:sz w:val="22"/>
         </w:rPr>
@@ -23,7 +23,7 @@
       </w:r>
       <w:r>
         <w:rPr>
-          <w:rFonts w:ascii="Arial" w:hAnsi="Arial"/>
+          <w:rFonts w:ascii="Courier New" w:hAnsi="Courier New"/>
           <w:b w:val="0"/>
           <w:sz w:val="22"/>
         </w:rPr>
@@ -33,7 +33,7 @@
     <w:p>
       <w:r>
         <w:rPr>
-          <w:rFonts w:ascii="Arial" w:hAnsi="Arial"/>
+          <w:rFonts w:ascii="Courier New" w:hAnsi="Courier New"/>
           <w:b w:val="0"/>
           <w:sz w:val="22"/>
         </w:rPr>
@@ -43,7 +43,7 @@
     <w:p>
       <w:r>
         <w:rPr>
-          <w:rFonts w:ascii="Arial" w:hAnsi="Arial"/>
+          <w:rFonts w:ascii="Courier New" w:hAnsi="Courier New"/>
           <w:b w:val="0"/>
           <w:sz w:val="22"/>
         </w:rPr>
@@ -53,7 +53,7 @@
     <w:p>
       <w:r>
         <w:rPr>
-          <w:rFonts w:ascii="Arial" w:hAnsi="Arial"/>
+          <w:rFonts w:ascii="Courier New" w:hAnsi="Courier New"/>
           <w:b w:val="0"/>
           <w:sz w:val="22"/>
         </w:rPr>
@@ -62,7 +62,7 @@
     <w:p>
       <w:r>
         <w:rPr>
-          <w:rFonts w:ascii="Arial" w:hAnsi="Arial"/>
+          <w:rFonts w:ascii="Courier New" w:hAnsi="Courier New"/>
           <w:b/>
           <w:sz w:val="22"/>
         </w:rPr>
@@ -70,7 +70,7 @@
       </w:r>
       <w:r>
         <w:rPr>
-          <w:rFonts w:ascii="Arial" w:hAnsi="Arial"/>
+          <w:rFonts w:ascii="Courier New" w:hAnsi="Courier New"/>
           <w:b w:val="0"/>
           <w:sz w:val="22"/>
         </w:rPr>
@@ -81,7 +81,7 @@
     <w:p>
       <w:r>
         <w:rPr>
-          <w:rFonts w:ascii="Arial" w:hAnsi="Arial"/>
+          <w:rFonts w:ascii="Courier New" w:hAnsi="Courier New"/>
           <w:b w:val="0"/>
           <w:sz w:val="22"/>
         </w:rPr>
@@ -93,7 +93,7 @@
     <w:p>
       <w:r>
         <w:rPr>
-          <w:rFonts w:ascii="Arial" w:hAnsi="Arial"/>
+          <w:rFonts w:ascii="Courier New" w:hAnsi="Courier New"/>
           <w:b w:val="0"/>
           <w:sz w:val="22"/>
         </w:rPr>
@@ -105,7 +105,7 @@
     <w:p>
       <w:r>
         <w:rPr>
-          <w:rFonts w:ascii="Arial" w:hAnsi="Arial"/>
+          <w:rFonts w:ascii="Courier New" w:hAnsi="Courier New"/>
           <w:b w:val="0"/>
           <w:sz w:val="22"/>
         </w:rPr>
@@ -114,7 +114,7 @@
     <w:p>
       <w:r>
         <w:rPr>
-          <w:rFonts w:ascii="Arial" w:hAnsi="Arial"/>
+          <w:rFonts w:ascii="Courier New" w:hAnsi="Courier New"/>
           <w:b w:val="0"/>
           <w:sz w:val="22"/>
         </w:rPr>
@@ -123,7 +123,7 @@
       </w:r>
       <w:r>
         <w:rPr>
-          <w:rFonts w:ascii="Arial" w:hAnsi="Arial"/>
+          <w:rFonts w:ascii="Courier New" w:hAnsi="Courier New"/>
           <w:b/>
           <w:sz w:val="22"/>
         </w:rPr>
@@ -133,7 +133,7 @@
     <w:p>
       <w:r>
         <w:rPr>
-          <w:rFonts w:ascii="Arial" w:hAnsi="Arial"/>
+          <w:rFonts w:ascii="Courier New" w:hAnsi="Courier New"/>
           <w:b w:val="0"/>
           <w:sz w:val="22"/>
         </w:rPr>
@@ -142,9 +142,9 @@
     <w:p>
       <w:r>
         <w:rPr>
-          <w:rFonts w:ascii="Arial" w:hAnsi="Arial"/>
+          <w:rFonts w:ascii="Courier New" w:hAnsi="Courier New"/>
           <w:b w:val="0"/>
-          <w:sz w:val="22"/>
+          <w:sz w:val="20"/>
         </w:rPr>
         <w:t>1.</w:t>
         <w:tab/>
@@ -154,18 +154,18 @@
     <w:p>
       <w:r>
         <w:rPr>
-          <w:rFonts w:ascii="Arial" w:hAnsi="Arial"/>
+          <w:rFonts w:ascii="Courier New" w:hAnsi="Courier New"/>
           <w:b w:val="0"/>
-          <w:sz w:val="22"/>
+          <w:sz w:val="20"/>
         </w:rPr>
       </w:r>
     </w:p>
     <w:p>
       <w:r>
         <w:rPr>
-          <w:rFonts w:ascii="Arial" w:hAnsi="Arial"/>
+          <w:rFonts w:ascii="Courier New" w:hAnsi="Courier New"/>
           <w:b w:val="0"/>
-          <w:sz w:val="22"/>
+          <w:sz w:val="20"/>
         </w:rPr>
         <w:t>2. Místem výkonu práce je {{MISTO_VYKONU}}.</w:t>
       </w:r>
@@ -173,19 +173,34 @@
     <w:p>
       <w:r>
         <w:rPr>
-          <w:rFonts w:ascii="Arial" w:hAnsi="Arial"/>
+          <w:rFonts w:ascii="Courier New" w:hAnsi="Courier New"/>
           <w:b w:val="0"/>
-          <w:sz w:val="22"/>
+          <w:sz w:val="20"/>
         </w:rPr>
       </w:r>
     </w:p>
     <w:p>
       <w:r>
         <w:rPr>
-          <w:rFonts w:ascii="Arial" w:hAnsi="Arial"/>
-          <w:sz w:val="22"/>
+          <w:rFonts w:ascii="Courier New" w:hAnsi="Courier New"/>
+          <w:sz w:val="20"/>
         </w:rPr>
-        <w:t>3. Den nástupu do práce je {{DATUM_NASTUPU}}. Tímto dnem vzniká mezi</w:t>
+        <w:t xml:space="preserve">3. Den nástupu do práce je </w:t>
+      </w:r>
+      <w:r>
+        <w:rPr>
+          <w:b/>
+          <w:rFonts w:ascii="Courier New" w:hAnsi="Courier New"/>
+          <w:sz w:val="20"/>
+        </w:rPr>
+        <w:t xml:space="preserve">{{DATUM_NASTUPU}}</w:t>
+      </w:r>
+      <w:r>
+        <w:rPr>
+          <w:rFonts w:ascii="Courier New" w:hAnsi="Courier New"/>
+          <w:sz w:val="20"/>
+        </w:rPr>
+        <w:t xml:space="preserve">. Tímto dnem vzniká mezi</w:t>
         <w:br/>
         <w:t>zaměstnavatelem a zaměstnancem pracovní poměr.</w:t>
         <w:br/>
@@ -197,37 +212,43 @@
     <w:p>
       <w:r>
         <w:rPr>
-          <w:rFonts w:ascii="Arial" w:hAnsi="Arial"/>
+          <w:rFonts w:ascii="Courier New" w:hAnsi="Courier New"/>
           <w:b w:val="0"/>
-          <w:sz w:val="22"/>
+          <w:sz w:val="20"/>
         </w:rPr>
       </w:r>
     </w:p>
     <w:p>
       <w:r>
         <w:rPr>
-          <w:rFonts w:ascii="Arial" w:hAnsi="Arial"/>
+          <w:rFonts w:ascii="Courier New" w:hAnsi="Courier New"/>
           <w:b w:val="0"/>
-          <w:sz w:val="22"/>
+          <w:sz w:val="20"/>
         </w:rPr>
         <w:t>4. Smluvní strany se dohodly na těchto dalších podmínkách:</w:t>
       </w:r>
     </w:p>
     <w:p>
+      <w:pPr>
+        <w:ind w:left="510" w:hanging="255"/>
+      </w:pPr>
       <w:r>
         <w:rPr>
-          <w:rFonts w:ascii="Arial" w:hAnsi="Arial"/>
+          <w:rFonts w:ascii="Courier New" w:hAnsi="Courier New"/>
           <w:b w:val="0"/>
-          <w:sz w:val="22"/>
+          <w:sz w:val="20"/>
         </w:rPr>
         <w:t>a) {% if DOBA_NEURCITA %}pracovní poměr uzavírají na dobu neurčitou;{% else %}pracovní poměr uzavírají na dobu určitou, a to do {{DATUM_UKONCENI}};{% endif %}</w:t>
       </w:r>
     </w:p>
     <w:p>
+      <w:pPr>
+        <w:ind w:left="510" w:hanging="255"/>
+      </w:pPr>
       <w:r>
         <w:rPr>
-          <w:rFonts w:ascii="Arial" w:hAnsi="Arial"/>
-          <w:sz w:val="22"/>
+          <w:rFonts w:ascii="Courier New" w:hAnsi="Courier New"/>
+          <w:sz w:val="20"/>
         </w:rPr>
         <w:t>b) sjednávají 5,0 - denní a rovnoměrně rozvrženou</w:t>
         <w:br/>
@@ -235,10 +256,13 @@
       </w:r>
     </w:p>
     <w:p>
+      <w:pPr>
+        <w:ind w:left="510" w:hanging="255"/>
+      </w:pPr>
       <w:r>
         <w:rPr>
-          <w:rFonts w:ascii="Arial" w:hAnsi="Arial"/>
-          <w:sz w:val="22"/>
+          <w:rFonts w:ascii="Courier New" w:hAnsi="Courier New"/>
+          <w:sz w:val="20"/>
         </w:rPr>
         <w:t>c) {% if ZKUSEBNI_DOBA %}sjednávají zkušební dobu v délce {{ZKUSEBNI_DOBA}}, ve které mohou obě</w:t>
         <w:br/>
@@ -246,10 +270,13 @@
       </w:r>
     </w:p>
     <w:p>
+      <w:pPr>
+        <w:ind w:left="510" w:hanging="255"/>
+      </w:pPr>
       <w:r>
         <w:rPr>
-          <w:rFonts w:ascii="Arial" w:hAnsi="Arial"/>
-          <w:sz w:val="22"/>
+          <w:rFonts w:ascii="Courier New" w:hAnsi="Courier New"/>
+          <w:sz w:val="20"/>
         </w:rPr>
         <w:t>d) zaměstnanec souhlasí s vysíláním na jednodenní pracovní</w:t>
         <w:br/>
@@ -261,19 +288,34 @@
     <w:p>
       <w:r>
         <w:rPr>
-          <w:rFonts w:ascii="Arial" w:hAnsi="Arial"/>
+          <w:rFonts w:ascii="Courier New" w:hAnsi="Courier New"/>
           <w:b w:val="0"/>
-          <w:sz w:val="22"/>
+          <w:sz w:val="20"/>
         </w:rPr>
       </w:r>
     </w:p>
     <w:p>
       <w:r>
         <w:rPr>
-          <w:rFonts w:ascii="Arial" w:hAnsi="Arial"/>
-          <w:sz w:val="22"/>
+          <w:rFonts w:ascii="Courier New" w:hAnsi="Courier New"/>
+          <w:sz w:val="20"/>
         </w:rPr>
-        <w:t>5. Nástupní tarif zaměstnance je {{MZDA}} Kč za měsíc.</w:t>
+        <w:t xml:space="preserve">5. Nástupní tarif zaměstnance je </w:t>
+      </w:r>
+      <w:r>
+        <w:rPr>
+          <w:b/>
+          <w:rFonts w:ascii="Courier New" w:hAnsi="Courier New"/>
+          <w:sz w:val="20"/>
+        </w:rPr>
+        <w:t xml:space="preserve">{{MZDA}}</w:t>
+      </w:r>
+      <w:r>
+        <w:rPr>
+          <w:rFonts w:ascii="Courier New" w:hAnsi="Courier New"/>
+          <w:sz w:val="20"/>
+        </w:rPr>
+        <w:t xml:space="preserve"> Kč za měsíc.</w:t>
         <w:br/>
         <w:t>Zaměstnavatel po uplynutí zkušební doby upraví tarif podle</w:t>
         <w:br/>
@@ -287,18 +329,18 @@
     <w:p>
       <w:r>
         <w:rPr>
-          <w:rFonts w:ascii="Arial" w:hAnsi="Arial"/>
+          <w:rFonts w:ascii="Courier New" w:hAnsi="Courier New"/>
           <w:b w:val="0"/>
-          <w:sz w:val="22"/>
+          <w:sz w:val="20"/>
         </w:rPr>
       </w:r>
     </w:p>
     <w:p>
       <w:r>
         <w:rPr>
-          <w:rFonts w:ascii="Arial" w:hAnsi="Arial"/>
+          <w:rFonts w:ascii="Courier New" w:hAnsi="Courier New"/>
           <w:b w:val="0"/>
-          <w:sz w:val="22"/>
+          <w:sz w:val="20"/>
         </w:rPr>
         <w:t>6. Zaměstnanec má nárok na 20 dnů dovolené na zotavenou ročně.</w:t>
       </w:r>
@@ -306,17 +348,17 @@
     <w:p>
       <w:r>
         <w:rPr>
-          <w:rFonts w:ascii="Arial" w:hAnsi="Arial"/>
+          <w:rFonts w:ascii="Courier New" w:hAnsi="Courier New"/>
           <w:b w:val="0"/>
-          <w:sz w:val="22"/>
+          <w:sz w:val="20"/>
         </w:rPr>
       </w:r>
     </w:p>
     <w:p>
       <w:r>
         <w:rPr>
-          <w:rFonts w:ascii="Arial" w:hAnsi="Arial"/>
-          <w:sz w:val="22"/>
+          <w:rFonts w:ascii="Courier New" w:hAnsi="Courier New"/>
+          <w:sz w:val="20"/>
         </w:rPr>
         <w:t xml:space="preserve">7. Zúčtovanou měsíční mzdu zaměstnavatel odešle nejpozději </w:t>
         <w:br/>
@@ -328,17 +370,17 @@
     <w:p>
       <w:r>
         <w:rPr>
-          <w:rFonts w:ascii="Arial" w:hAnsi="Arial"/>
+          <w:rFonts w:ascii="Courier New" w:hAnsi="Courier New"/>
           <w:b w:val="0"/>
-          <w:sz w:val="22"/>
+          <w:sz w:val="20"/>
         </w:rPr>
       </w:r>
     </w:p>
     <w:p>
       <w:r>
         <w:rPr>
-          <w:rFonts w:ascii="Arial" w:hAnsi="Arial"/>
-          <w:sz w:val="22"/>
+          <w:rFonts w:ascii="Courier New" w:hAnsi="Courier New"/>
+          <w:sz w:val="20"/>
         </w:rPr>
         <w:t>8. Zaměstnanec je povinen svědomitě vykonávat sjednanou práci</w:t>
         <w:br/>
@@ -352,17 +394,17 @@
     <w:p>
       <w:r>
         <w:rPr>
-          <w:rFonts w:ascii="Arial" w:hAnsi="Arial"/>
+          <w:rFonts w:ascii="Courier New" w:hAnsi="Courier New"/>
           <w:b w:val="0"/>
-          <w:sz w:val="22"/>
+          <w:sz w:val="20"/>
         </w:rPr>
       </w:r>
     </w:p>
     <w:p>
       <w:r>
         <w:rPr>
-          <w:rFonts w:ascii="Arial" w:hAnsi="Arial"/>
-          <w:sz w:val="22"/>
+          <w:rFonts w:ascii="Courier New" w:hAnsi="Courier New"/>
+          <w:sz w:val="20"/>
         </w:rPr>
         <w:t>9. Veškeré další nároky a povinnosti smluvních stran vyplývají</w:t>
         <w:br/>
@@ -378,16 +420,16 @@
     <w:p>
       <w:r>
         <w:rPr>
-          <w:rFonts w:ascii="Arial" w:hAnsi="Arial"/>
+          <w:rFonts w:ascii="Courier New" w:hAnsi="Courier New"/>
           <w:b w:val="0"/>
-          <w:sz w:val="22"/>
+          <w:sz w:val="20"/>
         </w:rPr>
       </w:r>
     </w:p>
     <w:p>
       <w:r>
         <w:rPr>
-          <w:rFonts w:ascii="Arial" w:hAnsi="Arial"/>
+          <w:rFonts w:ascii="Courier New" w:hAnsi="Courier New"/>
           <w:b w:val="0"/>
           <w:sz w:val="22"/>
         </w:rPr>
@@ -397,7 +439,7 @@
     <w:p>
       <w:r>
         <w:rPr>
-          <w:rFonts w:ascii="Arial" w:hAnsi="Arial"/>
+          <w:rFonts w:ascii="Courier New" w:hAnsi="Courier New"/>
           <w:b w:val="0"/>
           <w:sz w:val="22"/>
         </w:rPr>
@@ -406,7 +448,7 @@
     <w:p>
       <w:r>
         <w:rPr>
-          <w:rFonts w:ascii="Arial" w:hAnsi="Arial"/>
+          <w:rFonts w:ascii="Courier New" w:hAnsi="Courier New"/>
           <w:b w:val="0"/>
           <w:sz w:val="22"/>
         </w:rPr>
@@ -424,7 +466,7 @@
     <w:p>
       <w:r>
         <w:rPr>
-          <w:rFonts w:ascii="Arial" w:hAnsi="Arial"/>
+          <w:rFonts w:ascii="Courier New" w:hAnsi="Courier New"/>
           <w:b w:val="0"/>
           <w:sz w:val="22"/>
         </w:rPr>
@@ -441,7 +483,7 @@
     <w:p>
       <w:r>
         <w:rPr>
-          <w:rFonts w:ascii="Arial" w:hAnsi="Arial"/>
+          <w:rFonts w:ascii="Courier New" w:hAnsi="Courier New"/>
           <w:b w:val="0"/>
           <w:sz w:val="22"/>
         </w:rPr>
@@ -450,7 +492,7 @@
     <w:p>
       <w:r>
         <w:rPr>
-          <w:rFonts w:ascii="Arial" w:hAnsi="Arial"/>
+          <w:rFonts w:ascii="Courier New" w:hAnsi="Courier New"/>
           <w:b w:val="0"/>
           <w:sz w:val="22"/>
         </w:rPr>

</xml_diff>